<commit_message>
Make BankMind the new centerpiece across home, research, connect, and CV
</commit_message>
<xml_diff>
--- a/cv_arjunvir.docx
+++ b/cv_arjunvir.docx
@@ -1432,6 +1432,64 @@
           <w:szCs w:val="24"/>
         </w:rPr>
         <w:t xml:space="preserve">FEATURED PROJECTS</w:t>
+      </w:r>
+    </w:p>
+    <w:p>
+      <w:pPr>
+        <w:spacing w:after="20" w:before="80"/>
+      </w:pPr>
+      <w:r>
+        <w:rPr>
+          <w:rFonts w:ascii="Calibri" w:cs="Calibri" w:eastAsia="Calibri" w:hAnsi="Calibri"/>
+          <w:b/>
+          <w:bCs/>
+          <w:color w:val="1A1A1A"/>
+          <w:sz w:val="22"/>
+          <w:szCs w:val="22"/>
+        </w:rPr>
+        <w:t xml:space="preserve">bankmind</w:t>
+      </w:r>
+      <w:r>
+        <w:rPr>
+          <w:rFonts w:ascii="Calibri" w:cs="Calibri" w:eastAsia="Calibri" w:hAnsi="Calibri"/>
+          <w:color w:val="555555"/>
+          <w:sz w:val="20"/>
+          <w:szCs w:val="20"/>
+        </w:rPr>
+        <w:t xml:space="preserve">  —  </w:t>
+      </w:r>
+      <w:hyperlink w:history="1">
+        <w:r>
+          <w:rPr>
+            <w:rFonts w:ascii="Calibri" w:cs="Calibri" w:eastAsia="Calibri" w:hAnsi="Calibri"/>
+            <w:i/>
+            <w:iCs/>
+            <w:color w:val="2E75B6"/>
+            <w:sz w:val="19"/>
+            <w:szCs w:val="19"/>
+            <w:u w:val="single"/>
+          </w:rPr>
+          <w:t xml:space="preserve">github.com/Arjun10g/bankmind</w:t>
+        </w:r>
+      </w:hyperlink>
+    </w:p>
+    <w:p>
+      <w:pPr>
+        <w:pStyle w:val="ListParagraph"/>
+        <w:numPr>
+          <w:ilvl w:val="0"/>
+          <w:numId w:val="2"/>
+        </w:numPr>
+        <w:spacing w:after="30" w:line="264"/>
+      </w:pPr>
+      <w:r>
+        <w:rPr>
+          <w:rFonts w:ascii="Calibri" w:cs="Calibri" w:eastAsia="Calibri" w:hAnsi="Calibri"/>
+          <w:b/>
+          <w:bCs/>
+          <w:color w:val="1A1A1A"/>
+        </w:rPr>
+        <w:t xml:space="preserve">Production-grade RAG platform for financial intelligence with two specialized pipelines (regulatory compliance + credit analysis) sharing unified Qdrant infrastructure across 32,963 indexed chunks. Hybrid retrieval over Matryoshka dense embeddings + SPLADE++ + BM25; HyDE / Multi-Query / PRF / Step-Back query transforms; Cross-encoder / MonoT5 / ColBERT / RankGPT rerankers. Dual-track evaluation framework benchmarking 6 chunking strategies, 6 retrievers, 4 rerankers, and 4 query transforms; semantic chunking outperformed structure-driven strategies by 17 to 94 percent relative NDCG. Best NDCG@10 of 0.834 / Recall@5 of 0.920 on compliance ablation. Rule-based guardrails (citation enforcement, numerical grounding, staleness, confidence scoring). 5-tab Gradio dashboard deployed on Hugging Face Spaces.</w:t>
       </w:r>
     </w:p>
     <w:p>

</xml_diff>

<commit_message>
Add Hugging Face Spaces live demo link for BankMind across site and CV
</commit_message>
<xml_diff>
--- a/cv_arjunvir.docx
+++ b/cv_arjunvir.docx
@@ -1472,6 +1472,27 @@
           <w:t xml:space="preserve">github.com/Arjun10g/bankmind</w:t>
         </w:r>
       </w:hyperlink>
+      <w:r>
+        <w:rPr>
+          <w:rFonts w:ascii="Calibri" w:cs="Calibri" w:eastAsia="Calibri" w:hAnsi="Calibri"/>
+          <w:color w:val="555555"/>
+          <w:sz w:val="20"/>
+          <w:szCs w:val="20"/>
+        </w:rPr>
+        <w:t xml:space="preserve">  ·  </w:t>
+      </w:r>
+      <w:r>
+        <w:rPr>
+          <w:rFonts w:ascii="Calibri" w:cs="Calibri" w:eastAsia="Calibri" w:hAnsi="Calibri"/>
+          <w:i/>
+          <w:iCs/>
+          <w:color w:val="2E75B6"/>
+          <w:sz w:val="19"/>
+          <w:szCs w:val="19"/>
+          <w:u w:val="single"/>
+        </w:rPr>
+        <w:t xml:space="preserve">huggingface.co/spaces/arjun10g/bankmind</w:t>
+      </w:r>
     </w:p>
     <w:p>
       <w:pPr>

</xml_diff>

<commit_message>
Add live-expression-reader across home, research, connect, and CV
</commit_message>
<xml_diff>
--- a/cv_arjunvir.docx
+++ b/cv_arjunvir.docx
@@ -1511,6 +1511,85 @@
           <w:color w:val="1A1A1A"/>
         </w:rPr>
         <w:t xml:space="preserve">Production-grade RAG platform for financial intelligence with two specialized pipelines (regulatory compliance + credit analysis) sharing unified Qdrant infrastructure across 32,963 indexed chunks. Hybrid retrieval over Matryoshka dense embeddings + SPLADE++ + BM25; HyDE / Multi-Query / PRF / Step-Back query transforms; Cross-encoder / MonoT5 / ColBERT / RankGPT rerankers. Dual-track evaluation framework benchmarking 6 chunking strategies, 6 retrievers, 4 rerankers, and 4 query transforms; semantic chunking outperformed structure-driven strategies by 17 to 94 percent relative NDCG. Best NDCG@10 of 0.834 / Recall@5 of 0.920 on compliance ablation. Rule-based guardrails (citation enforcement, numerical grounding, staleness, confidence scoring). 5-tab Gradio dashboard deployed on Hugging Face Spaces.</w:t>
+      </w:r>
+    </w:p>
+    <w:p>
+      <w:pPr>
+        <w:spacing w:after="20" w:before="80"/>
+      </w:pPr>
+      <w:r>
+        <w:rPr>
+          <w:rFonts w:ascii="Calibri" w:cs="Calibri" w:eastAsia="Calibri" w:hAnsi="Calibri"/>
+          <w:b/>
+          <w:bCs/>
+          <w:color w:val="1A1A1A"/>
+          <w:sz w:val="22"/>
+          <w:szCs w:val="22"/>
+        </w:rPr>
+        <w:t xml:space="preserve">live-expression-reader</w:t>
+      </w:r>
+      <w:r>
+        <w:rPr>
+          <w:rFonts w:ascii="Calibri" w:cs="Calibri" w:eastAsia="Calibri" w:hAnsi="Calibri"/>
+          <w:color w:val="555555"/>
+          <w:sz w:val="20"/>
+          <w:szCs w:val="20"/>
+        </w:rPr>
+        <w:t xml:space="preserve">  —  </w:t>
+      </w:r>
+      <w:hyperlink w:history="1">
+        <w:r>
+          <w:rPr>
+            <w:rFonts w:ascii="Calibri" w:cs="Calibri" w:eastAsia="Calibri" w:hAnsi="Calibri"/>
+            <w:i/>
+            <w:iCs/>
+            <w:color w:val="2E75B6"/>
+            <w:sz w:val="19"/>
+            <w:szCs w:val="19"/>
+            <w:u w:val="single"/>
+          </w:rPr>
+          <w:t xml:space="preserve">github.com/Arjun10g/live-expression-reader</w:t>
+        </w:r>
+      </w:hyperlink>
+      <w:r>
+        <w:rPr>
+          <w:rFonts w:ascii="Calibri" w:cs="Calibri" w:eastAsia="Calibri" w:hAnsi="Calibri"/>
+          <w:color w:val="555555"/>
+          <w:sz w:val="20"/>
+          <w:szCs w:val="20"/>
+        </w:rPr>
+        <w:t xml:space="preserve">  ·  </w:t>
+      </w:r>
+      <w:r>
+        <w:rPr>
+          <w:rFonts w:ascii="Calibri" w:cs="Calibri" w:eastAsia="Calibri" w:hAnsi="Calibri"/>
+          <w:i/>
+          <w:iCs/>
+          <w:color w:val="2E75B6"/>
+          <w:sz w:val="19"/>
+          <w:szCs w:val="19"/>
+          <w:u w:val="single"/>
+        </w:rPr>
+        <w:t xml:space="preserve">arjun10g-live-expression-reader.static.hf.space</w:t>
+      </w:r>
+    </w:p>
+    <w:p>
+      <w:pPr>
+        <w:pStyle w:val="ListParagraph"/>
+        <w:numPr>
+          <w:ilvl w:val="0"/>
+          <w:numId w:val="2"/>
+        </w:numPr>
+        <w:spacing w:after="30" w:line="264"/>
+      </w:pPr>
+      <w:r>
+        <w:rPr>
+          <w:rFonts w:ascii="Calibri" w:cs="Calibri" w:eastAsia="Calibri" w:hAnsi="Calibri"/>
+          <w:b/>
+          <w:bCs/>
+          <w:color w:val="1A1A1A"/>
+        </w:rPr>
+        <w:t xml:space="preserve">Real-time, browser-based facial expression analyzer running entirely client-side. 478 facial landmarks + 52 ARKit blendshapes via MediaPipe Tasks Vision; HSEmotion (enet_b0_8_va_mtl) ONNX model for 8 primary emotions plus continuous valence/arousal on the Russell circumplex. Personal calibration via 3-second baseline capture and an optional Naive Bayes classifier. Cognitive state derivations: drowsiness (PERCLOS), focus, confusion, boredom, stress, engagement, calmness; compound emotions via DTM14. FACS-grounded multi-turn LLM explanations served through a Cloudflare Worker proxy with rate limiting; only numerical features ever leave the device, no video frames. Built in TypeScript + Vite + Tailwind on onnxruntime-web; deployed to Hugging Face Spaces (Static SDK).</w:t>
       </w:r>
     </w:p>
     <w:p>

</xml_diff>

<commit_message>
Add zeroshotGPU and grocery-price-dashboard across home, research, connect, and CV
</commit_message>
<xml_diff>
--- a/cv_arjunvir.docx
+++ b/cv_arjunvir.docx
@@ -1511,6 +1511,143 @@
           <w:color w:val="1A1A1A"/>
         </w:rPr>
         <w:t xml:space="preserve">Production-grade RAG platform for financial intelligence with two specialized pipelines (regulatory compliance + credit analysis) sharing unified Qdrant infrastructure across 32,963 indexed chunks. Hybrid retrieval over Matryoshka dense embeddings + SPLADE++ + BM25; HyDE / Multi-Query / PRF / Step-Back query transforms; Cross-encoder / MonoT5 / ColBERT / RankGPT rerankers. Dual-track evaluation framework benchmarking 6 chunking strategies, 6 retrievers, 4 rerankers, and 4 query transforms; semantic chunking outperformed structure-driven strategies by 17 to 94 percent relative NDCG. Best NDCG@10 of 0.834 / Recall@5 of 0.920 on compliance ablation. Rule-based guardrails (citation enforcement, numerical grounding, staleness, confidence scoring). 5-tab Gradio dashboard deployed on Hugging Face Spaces.</w:t>
+      </w:r>
+    </w:p>
+    <w:p>
+      <w:pPr>
+        <w:spacing w:after="20" w:before="80"/>
+      </w:pPr>
+      <w:r>
+        <w:rPr>
+          <w:rFonts w:ascii="Calibri" w:cs="Calibri" w:eastAsia="Calibri" w:hAnsi="Calibri"/>
+          <w:b/>
+          <w:bCs/>
+          <w:color w:val="1A1A1A"/>
+          <w:sz w:val="22"/>
+          <w:szCs w:val="22"/>
+        </w:rPr>
+        <w:t xml:space="preserve">zeroshotGPU</w:t>
+      </w:r>
+      <w:r>
+        <w:rPr>
+          <w:rFonts w:ascii="Calibri" w:cs="Calibri" w:eastAsia="Calibri" w:hAnsi="Calibri"/>
+          <w:color w:val="555555"/>
+          <w:sz w:val="20"/>
+          <w:szCs w:val="20"/>
+        </w:rPr>
+        <w:t xml:space="preserve">  —  </w:t>
+      </w:r>
+      <w:hyperlink w:history="1">
+        <w:r>
+          <w:rPr>
+            <w:rFonts w:ascii="Calibri" w:cs="Calibri" w:eastAsia="Calibri" w:hAnsi="Calibri"/>
+            <w:i/>
+            <w:iCs/>
+            <w:color w:val="2E75B6"/>
+            <w:sz w:val="19"/>
+            <w:szCs w:val="19"/>
+            <w:u w:val="single"/>
+          </w:rPr>
+          <w:t xml:space="preserve">github.com/Arjun10g/zeroshotGPU</w:t>
+        </w:r>
+      </w:hyperlink>
+      <w:r>
+        <w:rPr>
+          <w:rFonts w:ascii="Calibri" w:cs="Calibri" w:eastAsia="Calibri" w:hAnsi="Calibri"/>
+          <w:color w:val="555555"/>
+          <w:sz w:val="20"/>
+          <w:szCs w:val="20"/>
+        </w:rPr>
+        <w:t xml:space="preserve">  ·  </w:t>
+      </w:r>
+      <w:r>
+        <w:rPr>
+          <w:rFonts w:ascii="Calibri" w:cs="Calibri" w:eastAsia="Calibri" w:hAnsi="Calibri"/>
+          <w:i/>
+          <w:iCs/>
+          <w:color w:val="2E75B6"/>
+          <w:sz w:val="19"/>
+          <w:szCs w:val="19"/>
+          <w:u w:val="single"/>
+        </w:rPr>
+        <w:t xml:space="preserve">huggingface.co/spaces/arjun10g/zeroshotGPU</w:t>
+      </w:r>
+    </w:p>
+    <w:p>
+      <w:pPr>
+        <w:pStyle w:val="ListParagraph"/>
+        <w:numPr>
+          <w:ilvl w:val="0"/>
+          <w:numId w:val="2"/>
+        </w:numPr>
+        <w:spacing w:after="30" w:line="264"/>
+      </w:pPr>
+      <w:r>
+        <w:rPr>
+          <w:rFonts w:ascii="Calibri" w:cs="Calibri" w:eastAsia="Calibri" w:hAnsi="Calibri"/>
+          <w:b/>
+          <w:bCs/>
+          <w:color w:val="1A1A1A"/>
+        </w:rPr>
+        <w:t xml:space="preserve">Agentic zero-shot document parser implemented as a self-hosted parsing control plane: profile pages (scanned vs. digital, table density, multi-column layout, formula density), route to specialized parsers (Docling, PyMuPDF, Marker, MinerU, olmOCR, PaddleOCR, Unstructured), merge candidates with conflict detection, verify against 8 metric families (layout F1, table-structure score, formula CER, retrieval recall@k + MRR, parser disagreement, repair resolution / regression, parser contributions, throughput), then iteratively repair weak regions deterministic-first before invoking Qwen2.5-VL-3B on ZeroGPU. Emits retrieval-ready chunks across a strategy ladder with SHA-256 checksummed artifacts. Dual API (Python CLI + Gradio); 254 unit tests passing; deployed on Hugging Face Spaces with ZeroGPU integration.</w:t>
+      </w:r>
+    </w:p>
+    <w:p>
+      <w:pPr>
+        <w:spacing w:after="20" w:before="80"/>
+      </w:pPr>
+      <w:r>
+        <w:rPr>
+          <w:rFonts w:ascii="Calibri" w:cs="Calibri" w:eastAsia="Calibri" w:hAnsi="Calibri"/>
+          <w:b/>
+          <w:bCs/>
+          <w:color w:val="1A1A1A"/>
+          <w:sz w:val="22"/>
+          <w:szCs w:val="22"/>
+        </w:rPr>
+        <w:t xml:space="preserve">grocery-price-dashboard</w:t>
+      </w:r>
+      <w:r>
+        <w:rPr>
+          <w:rFonts w:ascii="Calibri" w:cs="Calibri" w:eastAsia="Calibri" w:hAnsi="Calibri"/>
+          <w:color w:val="555555"/>
+          <w:sz w:val="20"/>
+          <w:szCs w:val="20"/>
+        </w:rPr>
+        <w:t xml:space="preserve">  —  </w:t>
+      </w:r>
+      <w:hyperlink w:history="1">
+        <w:r>
+          <w:rPr>
+            <w:rFonts w:ascii="Calibri" w:cs="Calibri" w:eastAsia="Calibri" w:hAnsi="Calibri"/>
+            <w:i/>
+            <w:iCs/>
+            <w:color w:val="2E75B6"/>
+            <w:sz w:val="19"/>
+            <w:szCs w:val="19"/>
+            <w:u w:val="single"/>
+          </w:rPr>
+          <w:t xml:space="preserve">github.com/Arjun10g/grocery-price-dashboard</w:t>
+        </w:r>
+      </w:hyperlink>
+    </w:p>
+    <w:p>
+      <w:pPr>
+        <w:pStyle w:val="ListParagraph"/>
+        <w:numPr>
+          <w:ilvl w:val="0"/>
+          <w:numId w:val="2"/>
+        </w:numPr>
+        <w:spacing w:after="30" w:line="264"/>
+      </w:pPr>
+      <w:r>
+        <w:rPr>
+          <w:rFonts w:ascii="Calibri" w:cs="Calibri" w:eastAsia="Calibri" w:hAnsi="Calibri"/>
+          <w:b/>
+          <w:bCs/>
+          <w:color w:val="1A1A1A"/>
+        </w:rPr>
+        <w:t xml:space="preserve">Public read-only dashboard visualizing 165K+ Canadian grocery price observations sourced from a custom ingestion pipeline across StatCan provincial averages, Loblaws and Sobeys retailer APIs, Schema.org markup on long-tail grocers, and crowdsourced Open Food Facts. Routes for product search, product detail with price-history charts (Recharts), source confidence metrics with pipeline-run health (success / failure / dead-letter queue), and 1,931 stores grouped by province (OpenStreetMap Overpass). Built on Next.js 16 (App Router), TypeScript, Tailwind 4; backed by Supabase with row-level security. Server-side revalidation; biweekly refresh via Cloud Run + Cloud Scheduler; deployed via Docker on Hugging Face Spaces.</w:t>
       </w:r>
     </w:p>
     <w:p>

</xml_diff>

<commit_message>
Add na-tech-jobs as featured ML platform across home, research, connect, and CV
</commit_message>
<xml_diff>
--- a/cv_arjunvir.docx
+++ b/cv_arjunvir.docx
@@ -1511,6 +1511,85 @@
           <w:color w:val="1A1A1A"/>
         </w:rPr>
         <w:t xml:space="preserve">Production-grade RAG platform for financial intelligence with two specialized pipelines (regulatory compliance + credit analysis) sharing unified Qdrant infrastructure across 32,963 indexed chunks. Hybrid retrieval over Matryoshka dense embeddings + SPLADE++ + BM25; HyDE / Multi-Query / PRF / Step-Back query transforms; Cross-encoder / MonoT5 / ColBERT / RankGPT rerankers. Dual-track evaluation framework benchmarking 6 chunking strategies, 6 retrievers, 4 rerankers, and 4 query transforms; semantic chunking outperformed structure-driven strategies by 17 to 94 percent relative NDCG. Best NDCG@10 of 0.834 / Recall@5 of 0.920 on compliance ablation. Rule-based guardrails (citation enforcement, numerical grounding, staleness, confidence scoring). 5-tab Gradio dashboard deployed on Hugging Face Spaces.</w:t>
+      </w:r>
+    </w:p>
+    <w:p>
+      <w:pPr>
+        <w:spacing w:after="20" w:before="80"/>
+      </w:pPr>
+      <w:r>
+        <w:rPr>
+          <w:rFonts w:ascii="Calibri" w:cs="Calibri" w:eastAsia="Calibri" w:hAnsi="Calibri"/>
+          <w:b/>
+          <w:bCs/>
+          <w:color w:val="1A1A1A"/>
+          <w:sz w:val="22"/>
+          <w:szCs w:val="22"/>
+        </w:rPr>
+        <w:t xml:space="preserve">na-tech-jobs</w:t>
+      </w:r>
+      <w:r>
+        <w:rPr>
+          <w:rFonts w:ascii="Calibri" w:cs="Calibri" w:eastAsia="Calibri" w:hAnsi="Calibri"/>
+          <w:color w:val="555555"/>
+          <w:sz w:val="20"/>
+          <w:szCs w:val="20"/>
+        </w:rPr>
+        <w:t xml:space="preserve">  —  </w:t>
+      </w:r>
+      <w:hyperlink w:history="1">
+        <w:r>
+          <w:rPr>
+            <w:rFonts w:ascii="Calibri" w:cs="Calibri" w:eastAsia="Calibri" w:hAnsi="Calibri"/>
+            <w:i/>
+            <w:iCs/>
+            <w:color w:val="2E75B6"/>
+            <w:sz w:val="19"/>
+            <w:szCs w:val="19"/>
+            <w:u w:val="single"/>
+          </w:rPr>
+          <w:t xml:space="preserve">github.com/Arjun10g/na-tech-jobs</w:t>
+        </w:r>
+      </w:hyperlink>
+      <w:r>
+        <w:rPr>
+          <w:rFonts w:ascii="Calibri" w:cs="Calibri" w:eastAsia="Calibri" w:hAnsi="Calibri"/>
+          <w:color w:val="555555"/>
+          <w:sz w:val="20"/>
+          <w:szCs w:val="20"/>
+        </w:rPr>
+        <w:t xml:space="preserve">  ·  </w:t>
+      </w:r>
+      <w:r>
+        <w:rPr>
+          <w:rFonts w:ascii="Calibri" w:cs="Calibri" w:eastAsia="Calibri" w:hAnsi="Calibri"/>
+          <w:i/>
+          <w:iCs/>
+          <w:color w:val="2E75B6"/>
+          <w:sz w:val="19"/>
+          <w:szCs w:val="19"/>
+          <w:u w:val="single"/>
+        </w:rPr>
+        <w:t xml:space="preserve">arjun10g-na-tech-jobs.hf.space</w:t>
+      </w:r>
+    </w:p>
+    <w:p>
+      <w:pPr>
+        <w:pStyle w:val="ListParagraph"/>
+        <w:numPr>
+          <w:ilvl w:val="0"/>
+          <w:numId w:val="2"/>
+        </w:numPr>
+        <w:spacing w:after="30" w:line="264"/>
+      </w:pPr>
+      <w:r>
+        <w:rPr>
+          <w:rFonts w:ascii="Calibri" w:cs="Calibri" w:eastAsia="Calibri" w:hAnsi="Calibri"/>
+          <w:b/>
+          <w:bCs/>
+          <w:color w:val="1A1A1A"/>
+        </w:rPr>
+        <w:t xml:space="preserve">End-to-end production ML platform for the North American senior data-science / ML hiring market. Weekly asyncio ingestion from 6 ATS platforms (Greenhouse, Lever, Ashby, Workable, SmartRecruiters, Workday) with Pandera schema validation and parquet snapshots versioned on Hugging Face Hub (12,334 active jobs across 477 companies). Four trained, versioned models: XGBoost salary regressor (Optuna-tuned, MAE $29,091, MAPE 14.7%, R^2 log-salary 0.730); frozen sentence-transformers/all-MiniLM-L6-v2 + multinomial LR for seniority (7 classes, F1 0.812) and role-family (6 classes, F1 0.934); regex-first skills extractor with optional NuExtract fallback. Hybrid retrieval over 12,334 jobs to 29,311 parents to 120,004 children via Qdrant: dense first-pass to sparse to RRF fusion to cross-encoder rerank to parent hydration (recall@10 0.486, +34% over dense-only). Five-tab Gradio app: Salary Predictor, Search, Matcher, Analytics (Qwen2.5-7B NL-to-DuckDB-SQL with 61-test safety contract: keyword filter, table/column allowlists, statement timeouts, always-show SQL), and Dashboard. Closed-loop ops: weekly Evidently PSI drift detection, monthly champion/challenger retraining gated on +1% primary / -2% secondary; GitHub Actions CI for ingest / drift / retrain / deploy. Runs on a single $9/month Hugging Face Space.</w:t>
       </w:r>
     </w:p>
     <w:p>

</xml_diff>